<commit_message>
Correct a gramatic bug
</commit_message>
<xml_diff>
--- a/project_1/lab_report_1.docx
+++ b/project_1/lab_report_1.docx
@@ -3922,8 +3922,6 @@
           <w:lang w:val="ru-RU"/>
         </w:rPr>
       </w:pPr>
-      <w:bookmarkStart w:id="8" w:name="_GoBack"/>
-      <w:bookmarkEnd w:id="8"/>
     </w:p>
     <w:p>
       <w:pPr>
@@ -4042,7 +4040,7 @@
           <w:lang w:val="ru-RU"/>
         </w:rPr>
       </w:pPr>
-      <w:bookmarkStart w:id="9" w:name="_Toc242718250"/>
+      <w:bookmarkStart w:id="8" w:name="_Toc242718250"/>
       <w:r>
         <w:rPr>
           <w:b/>
@@ -4052,7 +4050,7 @@
         </w:rPr>
         <w:t>Описание программы</w:t>
       </w:r>
-      <w:bookmarkEnd w:id="9"/>
+      <w:bookmarkEnd w:id="8"/>
     </w:p>
     <w:p>
       <w:pPr>
@@ -6634,7 +6632,7 @@
           <w:lang w:val="ru-RU"/>
         </w:rPr>
       </w:pPr>
-      <w:bookmarkStart w:id="10" w:name="_Toc242718251"/>
+      <w:bookmarkStart w:id="9" w:name="_Toc242718251"/>
       <w:r>
         <w:rPr>
           <w:b/>
@@ -6644,7 +6642,7 @@
         </w:rPr>
         <w:t>Рекомендации пользователя</w:t>
       </w:r>
-      <w:bookmarkEnd w:id="10"/>
+      <w:bookmarkEnd w:id="9"/>
       <w:r>
         <w:rPr>
           <w:b/>
@@ -6891,7 +6889,7 @@
           <w:lang w:val="ru-RU"/>
         </w:rPr>
       </w:pPr>
-      <w:bookmarkStart w:id="11" w:name="_Toc242718252"/>
+      <w:bookmarkStart w:id="10" w:name="_Toc242718252"/>
       <w:r>
         <w:rPr>
           <w:b/>
@@ -6901,7 +6899,7 @@
         </w:rPr>
         <w:t>Рекомендации программиста</w:t>
       </w:r>
-      <w:bookmarkEnd w:id="11"/>
+      <w:bookmarkEnd w:id="10"/>
     </w:p>
     <w:p>
       <w:pPr>
@@ -7223,7 +7221,7 @@
           <w:szCs w:val="32"/>
         </w:rPr>
       </w:pPr>
-      <w:bookmarkStart w:id="12" w:name="_Toc242718253"/>
+      <w:bookmarkStart w:id="11" w:name="_Toc242718253"/>
       <w:r>
         <w:rPr>
           <w:b/>
@@ -7242,7 +7240,7 @@
         </w:rPr>
         <w:t>пример</w:t>
       </w:r>
-      <w:bookmarkEnd w:id="12"/>
+      <w:bookmarkEnd w:id="11"/>
     </w:p>
     <w:p>
       <w:pPr>
@@ -7712,19 +7710,20 @@
           <w:tab w:val="left" w:pos="4350"/>
         </w:tabs>
         <w:ind w:hanging="1701"/>
-        <w:rPr>
-          <w:lang w:val="ru-RU"/>
-        </w:rPr>
-      </w:pPr>
-      <w:r>
-        <w:rPr>
-          <w:noProof/>
+        <w:jc w:val="center"/>
+        <w:rPr>
+          <w:lang w:val="ru-RU"/>
+        </w:rPr>
+      </w:pPr>
+      <w:r>
+        <w:rPr>
+          <w:lang w:val="ru-RU"/>
         </w:rPr>
         <w:drawing>
-          <wp:inline distT="0" distB="0" distL="0" distR="0" wp14:anchorId="3A9117E2" wp14:editId="6B4E1543">
-            <wp:extent cx="7534275" cy="1247775"/>
-            <wp:effectExtent l="0" t="0" r="9525" b="9525"/>
-            <wp:docPr id="10" name="Рисунок 10"/>
+          <wp:inline distT="0" distB="0" distL="0" distR="0" wp14:anchorId="35CF8AFF" wp14:editId="25268F8B">
+            <wp:extent cx="7553325" cy="1143000"/>
+            <wp:effectExtent l="0" t="0" r="9525" b="0"/>
+            <wp:docPr id="2" name="Рисунок 2"/>
             <wp:cNvGraphicFramePr>
               <a:graphicFrameLocks xmlns:a="http://schemas.openxmlformats.org/drawingml/2006/main" noChangeAspect="1"/>
             </wp:cNvGraphicFramePr>
@@ -7744,7 +7743,7 @@
                   <pic:spPr>
                     <a:xfrm>
                       <a:off x="0" y="0"/>
-                      <a:ext cx="7534275" cy="1247775"/>
+                      <a:ext cx="7553325" cy="1143000"/>
                     </a:xfrm>
                     <a:prstGeom prst="rect">
                       <a:avLst/>
@@ -7778,14 +7777,8 @@
         </w:rPr>
         <w:t>рисунок 9.4 – Пример 5 столбцов сгенерированной базы данных</w:t>
       </w:r>
-    </w:p>
-    <w:p>
-      <w:pPr>
-        <w:ind w:left="2160" w:firstLine="0"/>
-        <w:rPr>
-          <w:lang w:val="ru-RU"/>
-        </w:rPr>
-      </w:pPr>
+      <w:bookmarkStart w:id="12" w:name="_GoBack"/>
+      <w:bookmarkEnd w:id="12"/>
     </w:p>
     <w:p>
       <w:pPr>
@@ -8011,7 +8004,7 @@
             <w:noProof/>
             <w:lang w:val="ru-RU"/>
           </w:rPr>
-          <w:t>10</w:t>
+          <w:t>15</w:t>
         </w:r>
         <w:r>
           <w:fldChar w:fldCharType="end"/>
@@ -11334,7 +11327,7 @@
 </file>
 
 <file path=customXml/itemProps1.xml><?xml version="1.0" encoding="utf-8"?>
-<ds:datastoreItem xmlns:ds="http://schemas.openxmlformats.org/officeDocument/2006/customXml" ds:itemID="{38DEBE3E-2CD9-4202-837A-EC55FC556183}">
+<ds:datastoreItem xmlns:ds="http://schemas.openxmlformats.org/officeDocument/2006/customXml" ds:itemID="{2C2DCB7E-A706-4B56-9D27-19315692D44A}">
   <ds:schemaRefs>
     <ds:schemaRef ds:uri="http://schemas.openxmlformats.org/officeDocument/2006/bibliography"/>
   </ds:schemaRefs>

</xml_diff>